<commit_message>
überarbeitung der ansätze, noch nicht vollständig
</commit_message>
<xml_diff>
--- a/notes/Text/Schutzmechanimen_Prompt_Injection.docx
+++ b/notes/Text/Schutzmechanimen_Prompt_Injection.docx
@@ -11386,13 +11386,6 @@
           <w:t>Defense Against Indirect Prompt Injection via Tool Result Parsing</w:t>
         </w:r>
       </w:hyperlink>
-    </w:p>
-    <w:p>
-      <w:pPr>
-        <w:rPr>
-          <w:lang w:val="en-US"/>
-        </w:rPr>
-      </w:pPr>
     </w:p>
     <w:sectPr>
       <w:footerReference w:type="even" r:id="rId26"/>

</xml_diff>